<commit_message>
add case from Beglium
</commit_message>
<xml_diff>
--- a/Text/Euoniticellus_fulvus_text_subm.docx
+++ b/Text/Euoniticellus_fulvus_text_subm.docx
@@ -178,21 +178,7 @@
         <w:rPr>
           <w:rFonts w:ascii="Times New Roman" w:hAnsi="Times New Roman" w:cs="Times New Roman"/>
         </w:rPr>
-        <w:t xml:space="preserve"> Goeze, 1777 is recorded after 57 years from western Bohemia from Horšovský Týn: CZ – Bohemia occ., Horšov (6443c), 49°32’32.813”N, 12°54’37.864”E, 380 m a.</w:t>
-      </w:r>
-      <w:proofErr w:type="gramStart"/>
-      <w:r>
-        <w:rPr>
-          <w:rFonts w:ascii="Times New Roman" w:hAnsi="Times New Roman" w:cs="Times New Roman"/>
-        </w:rPr>
-        <w:t>s.l.</w:t>
-      </w:r>
-      <w:proofErr w:type="gramEnd"/>
-      <w:r>
-        <w:rPr>
-          <w:rFonts w:ascii="Times New Roman" w:hAnsi="Times New Roman" w:cs="Times New Roman"/>
-        </w:rPr>
-        <w:t>, 8.vii.2025, 1 spec., J. Gaigr leg., det. et coll. The examined specimen was collected in horse dung on a dirt road.</w:t>
+        <w:t xml:space="preserve"> Goeze, 1777 is recorded after 57 years from western Bohemia from Horšovský Týn: CZ – Bohemia occ., Horšov (6443c), 49°32’32.813”N, 12°54’37.864”E, 380 m a.s.l., 8.vii.2025, 1 spec., J. Gaigr leg., det. et coll. The examined specimen was collected in horse dung on a dirt road.</w:t>
       </w:r>
     </w:p>
     <w:p>
@@ -285,21 +271,7 @@
         <w:rPr>
           <w:rFonts w:ascii="Times New Roman" w:hAnsi="Times New Roman" w:cs="Times New Roman"/>
         </w:rPr>
-        <w:t xml:space="preserve"> Goeze, 1777. Bohemia occ., Horšov, 5 km jižně (6443c), 49°32’32.813”N, 12°54’37.864”E, koňský trus na cestě, Horšovská obora, 380 m </w:t>
-      </w:r>
-      <w:proofErr w:type="gramStart"/>
-      <w:r>
-        <w:rPr>
-          <w:rFonts w:ascii="Times New Roman" w:hAnsi="Times New Roman" w:cs="Times New Roman"/>
-        </w:rPr>
-        <w:t>n.m.</w:t>
-      </w:r>
-      <w:proofErr w:type="gramEnd"/>
-      <w:r>
-        <w:rPr>
-          <w:rFonts w:ascii="Times New Roman" w:hAnsi="Times New Roman" w:cs="Times New Roman"/>
-        </w:rPr>
-        <w:t>, 8.V</w:t>
+        <w:t xml:space="preserve"> Goeze, 1777. Bohemia occ., Horšov, 5 km jižně (6443c), 49°32’32.813”N, 12°54’37.864”E, koňský trus na cestě, Horšovská obora, 380 m n.m., 8.V</w:t>
       </w:r>
       <w:r>
         <w:rPr>
@@ -347,14 +319,61 @@
           <w:i/>
           <w:iCs/>
         </w:rPr>
-        <w:t>Onthophagus coenobita</w:t>
-      </w:r>
-      <w:r>
-        <w:rPr>
-          <w:rFonts w:ascii="Times New Roman" w:hAnsi="Times New Roman" w:cs="Times New Roman"/>
-        </w:rPr>
-        <w:t>, při náhodném sběru na cestě v lipové aleji. Okolí šotolinové cesty na lokalitě tvoří trvalý travní porost a zemědělská půda. Nejbližší aktivně využívaná koňská pastvina se nachází přibližně 500 m od místa nálezu.</w:t>
-      </w:r>
+        <w:t>Onthophagus</w:t>
+      </w:r>
+      <w:r>
+        <w:rPr>
+          <w:rFonts w:ascii="Times New Roman" w:hAnsi="Times New Roman" w:cs="Times New Roman"/>
+          <w:i/>
+          <w:iCs/>
+        </w:rPr>
+        <w:t xml:space="preserve"> (</w:t>
+      </w:r>
+      <w:r>
+        <w:rPr>
+          <w:rFonts w:ascii="Times New Roman" w:hAnsi="Times New Roman" w:cs="Times New Roman"/>
+          <w:i/>
+          <w:iCs/>
+        </w:rPr>
+        <w:t>Palaeonthophagus</w:t>
+      </w:r>
+      <w:r>
+        <w:rPr>
+          <w:rFonts w:ascii="Times New Roman" w:hAnsi="Times New Roman" w:cs="Times New Roman"/>
+          <w:i/>
+          <w:iCs/>
+        </w:rPr>
+        <w:t>)</w:t>
+      </w:r>
+      <w:r>
+        <w:rPr>
+          <w:rFonts w:ascii="Times New Roman" w:hAnsi="Times New Roman" w:cs="Times New Roman"/>
+          <w:i/>
+          <w:iCs/>
+        </w:rPr>
+        <w:t xml:space="preserve"> coenobita</w:t>
+      </w:r>
+      <w:r>
+        <w:rPr>
+          <w:rFonts w:ascii="Times New Roman" w:hAnsi="Times New Roman" w:cs="Times New Roman"/>
+          <w:iCs/>
+        </w:rPr>
+        <w:t xml:space="preserve"> (Herbst, 1783)</w:t>
+      </w:r>
+      <w:r>
+        <w:rPr>
+          <w:rFonts w:ascii="Times New Roman" w:hAnsi="Times New Roman" w:cs="Times New Roman"/>
+        </w:rPr>
+        <w:t xml:space="preserve"> </w:t>
+      </w:r>
+      <w:r>
+        <w:rPr>
+          <w:rFonts w:ascii="Times New Roman" w:hAnsi="Times New Roman" w:cs="Times New Roman"/>
+        </w:rPr>
+        <w:t>při náhodném sběru na cestě v lipové aleji. Okolí šotolinové cesty na lokalitě tvoří trvalý travní porost a zemědělská půda. Nejbližší aktivně využívaná koňská pastvina se nachází přibližně 500 m od místa nálezu.</w:t>
+      </w:r>
+      <w:bookmarkStart w:id="2" w:name="_GoBack"/>
+      <w:bookmarkEnd w:id="2"/>
     </w:p>
     <w:p>
       <w:pPr>
@@ -375,29 +394,27 @@
           <w:i/>
           <w:iCs/>
         </w:rPr>
-        <w:t xml:space="preserve">Euoniticellus </w:t>
-      </w:r>
-      <w:proofErr w:type="gramStart"/>
+        <w:t>Euoniticellus fulvus</w:t>
+      </w:r>
+      <w:r>
+        <w:rPr>
+          <w:rFonts w:ascii="Times New Roman" w:hAnsi="Times New Roman" w:cs="Times New Roman"/>
+        </w:rPr>
+        <w:t xml:space="preserve">) (Goeze, 1777) je drobný zástupce vrubounovitých brouků (Scarabaeidae), podčeledi Scarabaeinae, tribu Oniticellini. Dospělci měří 8–11 mm, tělo je štíhlé, mírně klenuté, se světle žlutohnědými až plavými krovkami a tmavší hlavou a štítem (Obr. 2). Na povrchu krovek je jemná, podélná rýhovitost, typická pro rod </w:t>
+      </w:r>
       <w:r>
         <w:rPr>
           <w:rFonts w:ascii="Times New Roman" w:hAnsi="Times New Roman" w:cs="Times New Roman"/>
           <w:i/>
           <w:iCs/>
         </w:rPr>
-        <w:t>fulvus</w:t>
-      </w:r>
-      <w:r>
-        <w:rPr>
-          <w:rFonts w:ascii="Times New Roman" w:hAnsi="Times New Roman" w:cs="Times New Roman"/>
-        </w:rPr>
-        <w:t>) (Goeze</w:t>
-      </w:r>
-      <w:proofErr w:type="gramEnd"/>
-      <w:r>
-        <w:rPr>
-          <w:rFonts w:ascii="Times New Roman" w:hAnsi="Times New Roman" w:cs="Times New Roman"/>
-        </w:rPr>
-        <w:t xml:space="preserve">, 1777) je drobný zástupce vrubounovitých brouků (Scarabaeidae), podčeledi Scarabaeinae, tribu Oniticellini. Dospělci měří 8–11 mm, tělo je štíhlé, mírně klenuté, se světle žlutohnědými až plavými krovkami a tmavší hlavou a štítem (Obr. 2). Na povrchu krovek je jemná, podélná rýhovitost, typická pro rod </w:t>
+        <w:t>Euoniticellus</w:t>
+      </w:r>
+      <w:r>
+        <w:rPr>
+          <w:rFonts w:ascii="Times New Roman" w:hAnsi="Times New Roman" w:cs="Times New Roman"/>
+        </w:rPr>
+        <w:t xml:space="preserve">. Samci mají na hlavě nízký štítkovitý výběžek. Nomenklatoricky byl druh původně popsán Goezem v roce 1777. V minulosti býval řazen také do rodů </w:t>
       </w:r>
       <w:r>
         <w:rPr>
@@ -405,13 +422,13 @@
           <w:i/>
           <w:iCs/>
         </w:rPr>
-        <w:t>Euoniticellus</w:t>
-      </w:r>
-      <w:r>
-        <w:rPr>
-          <w:rFonts w:ascii="Times New Roman" w:hAnsi="Times New Roman" w:cs="Times New Roman"/>
-        </w:rPr>
-        <w:t xml:space="preserve">. Samci mají na hlavě nízký štítkovitý výběžek. Nomenklatoricky byl druh původně popsán Goezem v roce 1777. V minulosti býval řazen také do rodů </w:t>
+        <w:t>Oniticellus</w:t>
+      </w:r>
+      <w:r>
+        <w:rPr>
+          <w:rFonts w:ascii="Times New Roman" w:hAnsi="Times New Roman" w:cs="Times New Roman"/>
+        </w:rPr>
+        <w:t xml:space="preserve"> nebo </w:t>
       </w:r>
       <w:r>
         <w:rPr>
@@ -419,13 +436,13 @@
           <w:i/>
           <w:iCs/>
         </w:rPr>
-        <w:t>Oniticellus</w:t>
-      </w:r>
-      <w:r>
-        <w:rPr>
-          <w:rFonts w:ascii="Times New Roman" w:hAnsi="Times New Roman" w:cs="Times New Roman"/>
-        </w:rPr>
-        <w:t xml:space="preserve"> nebo </w:t>
+        <w:t>Copris</w:t>
+      </w:r>
+      <w:r>
+        <w:rPr>
+          <w:rFonts w:ascii="Times New Roman" w:hAnsi="Times New Roman" w:cs="Times New Roman"/>
+        </w:rPr>
+        <w:t xml:space="preserve">, současné taxonomické pojetí stabilně užívá rod </w:t>
       </w:r>
       <w:r>
         <w:rPr>
@@ -433,13 +450,168 @@
           <w:i/>
           <w:iCs/>
         </w:rPr>
-        <w:t>Copris</w:t>
-      </w:r>
-      <w:r>
-        <w:rPr>
-          <w:rFonts w:ascii="Times New Roman" w:hAnsi="Times New Roman" w:cs="Times New Roman"/>
-        </w:rPr>
-        <w:t xml:space="preserve">, současné taxonomické pojetí stabilně užívá rod </w:t>
+        <w:t>Euoniticellus</w:t>
+      </w:r>
+      <w:r>
+        <w:rPr>
+          <w:rFonts w:ascii="Times New Roman" w:hAnsi="Times New Roman" w:cs="Times New Roman"/>
+        </w:rPr>
+        <w:t xml:space="preserve"> (</w:t>
+      </w:r>
+      <w:r>
+        <w:rPr>
+          <w:rFonts w:ascii="Times New Roman" w:hAnsi="Times New Roman" w:cs="Times New Roman"/>
+          <w:smallCaps/>
+        </w:rPr>
+        <w:t>G</w:t>
+      </w:r>
+      <w:r>
+        <w:rPr>
+          <w:rFonts w:ascii="Times New Roman" w:hAnsi="Times New Roman" w:cs="Times New Roman"/>
+          <w:smallCaps/>
+        </w:rPr>
+        <w:t>BIF</w:t>
+      </w:r>
+      <w:r>
+        <w:rPr>
+          <w:rFonts w:ascii="Times New Roman" w:hAnsi="Times New Roman" w:cs="Times New Roman"/>
+          <w:smallCaps/>
+        </w:rPr>
+        <w:t xml:space="preserve"> Secretariat</w:t>
+      </w:r>
+      <w:r>
+        <w:rPr>
+          <w:rFonts w:ascii="Times New Roman" w:hAnsi="Times New Roman" w:cs="Times New Roman"/>
+        </w:rPr>
+        <w:t xml:space="preserve"> 2023). Areál rozšíření zahrnuje velkou část Palearktu od jižní Evropy po Střední Asii, zasahuje do severní Afriky a na Blízký východ. Druh byl cíleně zavlečen a etablován také mimo původní areál v Austrálii, kde byl úspěšně introdukován v rámci biologického programu pro rozklad trusu hospodářských zvířat.</w:t>
+      </w:r>
+    </w:p>
+    <w:p>
+      <w:pPr>
+        <w:pStyle w:val="Zkladntext"/>
+        <w:rPr>
+          <w:rFonts w:ascii="Times New Roman" w:hAnsi="Times New Roman" w:cs="Times New Roman"/>
+        </w:rPr>
+      </w:pPr>
+      <w:r>
+        <w:rPr>
+          <w:rFonts w:ascii="Times New Roman" w:hAnsi="Times New Roman" w:cs="Times New Roman"/>
+        </w:rPr>
+        <w:t>V Česku je vázán na teplé otevřené pastviny, kde se vyvíjí v trusu velkých savců, převážně koní a skotu. Tesař (</w:t>
+      </w:r>
+      <w:r>
+        <w:rPr>
+          <w:rFonts w:ascii="Times New Roman" w:hAnsi="Times New Roman" w:cs="Times New Roman"/>
+          <w:smallCaps/>
+        </w:rPr>
+        <w:t>Tesař</w:t>
+      </w:r>
+      <w:r>
+        <w:rPr>
+          <w:rFonts w:ascii="Times New Roman" w:hAnsi="Times New Roman" w:cs="Times New Roman"/>
+        </w:rPr>
+        <w:t xml:space="preserve"> 1957) druh v Čechách uvádí z okolí Prahy a Radotína, na Moravě z Čejče a dalších lokalit. V posledním Červeném seznamu hodnocen jako zranitelný (</w:t>
+      </w:r>
+      <w:r>
+        <w:rPr>
+          <w:rFonts w:ascii="Times New Roman" w:hAnsi="Times New Roman" w:cs="Times New Roman"/>
+          <w:smallCaps/>
+        </w:rPr>
+        <w:t>Hejda</w:t>
+      </w:r>
+      <w:r>
+        <w:rPr>
+          <w:rFonts w:ascii="Times New Roman" w:hAnsi="Times New Roman" w:cs="Times New Roman"/>
+        </w:rPr>
+        <w:t xml:space="preserve"> et al. 2017). Na přelomu tisíciletí byl známý výskyt pouze na jižní Moravě (</w:t>
+      </w:r>
+      <w:r>
+        <w:rPr>
+          <w:rFonts w:ascii="Times New Roman" w:hAnsi="Times New Roman" w:cs="Times New Roman"/>
+          <w:smallCaps/>
+        </w:rPr>
+        <w:t>Chybík</w:t>
+      </w:r>
+      <w:r>
+        <w:rPr>
+          <w:rFonts w:ascii="Times New Roman" w:hAnsi="Times New Roman" w:cs="Times New Roman"/>
+        </w:rPr>
+        <w:t xml:space="preserve"> 2005). V Čechách by</w:t>
+      </w:r>
+      <w:r>
+        <w:rPr>
+          <w:rFonts w:ascii="Times New Roman" w:hAnsi="Times New Roman" w:cs="Times New Roman"/>
+        </w:rPr>
+        <w:t>l druh považován za vymizelý (</w:t>
+      </w:r>
+      <w:r>
+        <w:rPr>
+          <w:rFonts w:ascii="Times New Roman" w:hAnsi="Times New Roman" w:cs="Times New Roman"/>
+        </w:rPr>
+        <w:t xml:space="preserve">Juřena et al. 2008). V posledních dvou desetiletích však druh zjevně expanduje (Obr. 3). </w:t>
+      </w:r>
+      <w:r>
+        <w:rPr>
+          <w:rFonts w:ascii="Times New Roman" w:hAnsi="Times New Roman" w:cs="Times New Roman"/>
+          <w:smallCaps/>
+        </w:rPr>
+        <w:t>Peřinková</w:t>
+      </w:r>
+      <w:r>
+        <w:rPr>
+          <w:rFonts w:ascii="Times New Roman" w:hAnsi="Times New Roman" w:cs="Times New Roman"/>
+        </w:rPr>
+        <w:t xml:space="preserve"> a </w:t>
+      </w:r>
+      <w:r>
+        <w:rPr>
+          <w:rFonts w:ascii="Times New Roman" w:hAnsi="Times New Roman" w:cs="Times New Roman"/>
+          <w:smallCaps/>
+        </w:rPr>
+        <w:t>Fischer</w:t>
+      </w:r>
+      <w:r>
+        <w:rPr>
+          <w:rFonts w:ascii="Times New Roman" w:hAnsi="Times New Roman" w:cs="Times New Roman"/>
+        </w:rPr>
+        <w:t xml:space="preserve"> (2010) popisují šíření druhu do středních poloh </w:t>
+      </w:r>
+      <w:r>
+        <w:rPr>
+          <w:rFonts w:ascii="Times New Roman" w:hAnsi="Times New Roman" w:cs="Times New Roman"/>
+        </w:rPr>
+        <w:t xml:space="preserve">na jihozápadní Moravě, </w:t>
+      </w:r>
+      <w:r>
+        <w:rPr>
+          <w:rFonts w:ascii="Times New Roman" w:hAnsi="Times New Roman" w:cs="Times New Roman"/>
+          <w:smallCaps/>
+        </w:rPr>
+        <w:t>Mertlik</w:t>
+      </w:r>
+      <w:r>
+        <w:rPr>
+          <w:rFonts w:ascii="Times New Roman" w:hAnsi="Times New Roman" w:cs="Times New Roman"/>
+        </w:rPr>
+        <w:t xml:space="preserve"> (2019, 2020) dokládá šíření</w:t>
+      </w:r>
+      <w:r>
+        <w:rPr>
+          <w:rFonts w:ascii="Times New Roman" w:hAnsi="Times New Roman" w:cs="Times New Roman"/>
+        </w:rPr>
+        <w:t xml:space="preserve"> v n</w:t>
+      </w:r>
+      <w:r>
+        <w:rPr>
+          <w:rFonts w:ascii="Times New Roman" w:hAnsi="Times New Roman" w:cs="Times New Roman"/>
+        </w:rPr>
+        <w:t>ižších polohách východních Čech.</w:t>
+      </w:r>
+      <w:r>
+        <w:rPr>
+          <w:rFonts w:ascii="Times New Roman" w:hAnsi="Times New Roman" w:cs="Times New Roman"/>
+        </w:rPr>
+        <w:t xml:space="preserve"> </w:t>
       </w:r>
       <w:r>
         <w:rPr>
@@ -447,306 +619,152 @@
           <w:i/>
           <w:iCs/>
         </w:rPr>
-        <w:t>Euoniticellus</w:t>
-      </w:r>
-      <w:r>
-        <w:rPr>
-          <w:rFonts w:ascii="Times New Roman" w:hAnsi="Times New Roman" w:cs="Times New Roman"/>
-        </w:rPr>
-        <w:t xml:space="preserve"> (</w:t>
-      </w:r>
-      <w:r>
-        <w:rPr>
-          <w:rFonts w:ascii="Times New Roman" w:hAnsi="Times New Roman" w:cs="Times New Roman"/>
-          <w:smallCaps/>
-        </w:rPr>
-        <w:t>G</w:t>
-      </w:r>
-      <w:r>
-        <w:rPr>
-          <w:rFonts w:ascii="Times New Roman" w:hAnsi="Times New Roman" w:cs="Times New Roman"/>
-          <w:smallCaps/>
-        </w:rPr>
-        <w:t>BIF</w:t>
-      </w:r>
-      <w:r>
-        <w:rPr>
-          <w:rFonts w:ascii="Times New Roman" w:hAnsi="Times New Roman" w:cs="Times New Roman"/>
-          <w:smallCaps/>
-        </w:rPr>
-        <w:t xml:space="preserve"> Secretariat</w:t>
-      </w:r>
-      <w:r>
-        <w:rPr>
-          <w:rFonts w:ascii="Times New Roman" w:hAnsi="Times New Roman" w:cs="Times New Roman"/>
-        </w:rPr>
-        <w:t xml:space="preserve"> 2023). Areál rozšíření zahrnuje velkou část Palearktu od jižní Evropy po Střední Asii, zasahuje do severní Afriky a na Blízký východ. Druh byl cíleně zavlečen a etablován také mimo původní areál v Austrálii, kde byl úspěšně introdukován v rámci biologického programu pro rozklad trusu hospodářských zvířat.</w:t>
+        <w:t>E. fulvus</w:t>
+      </w:r>
+      <w:r>
+        <w:rPr>
+          <w:rFonts w:ascii="Times New Roman" w:hAnsi="Times New Roman" w:cs="Times New Roman"/>
+        </w:rPr>
+        <w:t xml:space="preserve"> </w:t>
+      </w:r>
+      <w:r>
+        <w:rPr>
+          <w:rFonts w:ascii="Times New Roman" w:hAnsi="Times New Roman" w:cs="Times New Roman"/>
+        </w:rPr>
+        <w:t>byl opět potvrzen na území Prahy (</w:t>
+      </w:r>
+      <w:r>
+        <w:rPr>
+          <w:rFonts w:ascii="Times New Roman" w:hAnsi="Times New Roman" w:cs="Times New Roman"/>
+          <w:smallCaps/>
+        </w:rPr>
+        <w:t>Sommer</w:t>
+      </w:r>
+      <w:r>
+        <w:rPr>
+          <w:rFonts w:ascii="Times New Roman" w:hAnsi="Times New Roman" w:cs="Times New Roman"/>
+        </w:rPr>
+        <w:t xml:space="preserve"> et al. 2024) a Českého krasu (</w:t>
+      </w:r>
+      <w:r>
+        <w:rPr>
+          <w:rFonts w:ascii="Times New Roman" w:hAnsi="Times New Roman" w:cs="Times New Roman"/>
+          <w:smallCaps/>
+        </w:rPr>
+        <w:t>Koštíř</w:t>
+      </w:r>
+      <w:r>
+        <w:rPr>
+          <w:rFonts w:ascii="Times New Roman" w:hAnsi="Times New Roman" w:cs="Times New Roman"/>
+        </w:rPr>
+        <w:t xml:space="preserve"> 2024). Nalezen byl i na Šumavě v nadmořské výšce 800 m. n. m. (</w:t>
+      </w:r>
+      <w:r>
+        <w:rPr>
+          <w:rFonts w:ascii="Times New Roman" w:hAnsi="Times New Roman" w:cs="Times New Roman"/>
+          <w:smallCaps/>
+        </w:rPr>
+        <w:t>Ambrožová</w:t>
+      </w:r>
+      <w:r>
+        <w:rPr>
+          <w:rFonts w:ascii="Times New Roman" w:hAnsi="Times New Roman" w:cs="Times New Roman"/>
+        </w:rPr>
+        <w:t xml:space="preserve"> et al. 2021). Historické údaje z území západních Čech byly publikovány z Františkových Lázní, Stříbra a Horažďovic (</w:t>
+      </w:r>
+      <w:r>
+        <w:rPr>
+          <w:rFonts w:ascii="Times New Roman" w:hAnsi="Times New Roman" w:cs="Times New Roman"/>
+          <w:smallCaps/>
+        </w:rPr>
+        <w:t>Juřena</w:t>
+      </w:r>
+      <w:r>
+        <w:rPr>
+          <w:rFonts w:ascii="Times New Roman" w:hAnsi="Times New Roman" w:cs="Times New Roman"/>
+        </w:rPr>
+        <w:t xml:space="preserve"> et al. 2008). Z území Plzeňského a Karlovarského kraje nebyl výskyt druhu </w:t>
+      </w:r>
+      <w:r>
+        <w:rPr>
+          <w:rFonts w:ascii="Times New Roman" w:hAnsi="Times New Roman" w:cs="Times New Roman"/>
+        </w:rPr>
+        <w:lastRenderedPageBreak/>
+        <w:t>v posledních desetiletích publikován (</w:t>
+      </w:r>
+      <w:r>
+        <w:rPr>
+          <w:rFonts w:ascii="Times New Roman" w:hAnsi="Times New Roman" w:cs="Times New Roman"/>
+          <w:smallCaps/>
+        </w:rPr>
+        <w:t>Týr</w:t>
+      </w:r>
+      <w:r>
+        <w:rPr>
+          <w:rFonts w:ascii="Times New Roman" w:hAnsi="Times New Roman" w:cs="Times New Roman"/>
+        </w:rPr>
+        <w:t xml:space="preserve"> 2021). Podobný trend šíření byl zaznamenán i v sousedním Německu (</w:t>
+      </w:r>
+      <w:r>
+        <w:rPr>
+          <w:rFonts w:ascii="Times New Roman" w:hAnsi="Times New Roman" w:cs="Times New Roman"/>
+          <w:smallCaps/>
+        </w:rPr>
+        <w:t>iNaturalist</w:t>
+      </w:r>
+      <w:r>
+        <w:rPr>
+          <w:rFonts w:ascii="Times New Roman" w:hAnsi="Times New Roman" w:cs="Times New Roman"/>
+        </w:rPr>
+        <w:t xml:space="preserve"> </w:t>
+      </w:r>
+      <w:r>
+        <w:rPr>
+          <w:rFonts w:ascii="Times New Roman" w:hAnsi="Times New Roman" w:cs="Times New Roman"/>
+          <w:smallCaps/>
+        </w:rPr>
+        <w:t>contributors</w:t>
+      </w:r>
+      <w:r>
+        <w:rPr>
+          <w:rFonts w:ascii="Times New Roman" w:hAnsi="Times New Roman" w:cs="Times New Roman"/>
+        </w:rPr>
+        <w:t xml:space="preserve"> 2025)</w:t>
+      </w:r>
+      <w:r>
+        <w:rPr>
+          <w:rFonts w:ascii="Times New Roman" w:hAnsi="Times New Roman" w:cs="Times New Roman"/>
+        </w:rPr>
+        <w:t xml:space="preserve"> a v Belgii (</w:t>
+      </w:r>
+      <w:r>
+        <w:rPr>
+          <w:rFonts w:ascii="Times New Roman" w:hAnsi="Times New Roman" w:cs="Times New Roman"/>
+          <w:smallCaps/>
+        </w:rPr>
+        <w:t>Miessen a Thieren</w:t>
+      </w:r>
+      <w:r>
+        <w:rPr>
+          <w:rFonts w:ascii="Times New Roman" w:hAnsi="Times New Roman" w:cs="Times New Roman"/>
+        </w:rPr>
+        <w:t xml:space="preserve"> 1998)</w:t>
+      </w:r>
+      <w:r>
+        <w:rPr>
+          <w:rFonts w:ascii="Times New Roman" w:hAnsi="Times New Roman" w:cs="Times New Roman"/>
+        </w:rPr>
+        <w:t>. Výše uvedený nález představuje první publikovaný doklad výskytu druhu na území Plzeňského a Karlovarského kraje po 56 letech.</w:t>
       </w:r>
     </w:p>
     <w:p>
       <w:pPr>
-        <w:pStyle w:val="Zkladntext"/>
-        <w:rPr>
-          <w:rFonts w:ascii="Times New Roman" w:hAnsi="Times New Roman" w:cs="Times New Roman"/>
-        </w:rPr>
-      </w:pPr>
-      <w:r>
-        <w:rPr>
-          <w:rFonts w:ascii="Times New Roman" w:hAnsi="Times New Roman" w:cs="Times New Roman"/>
-        </w:rPr>
-        <w:t>V Česku je vázán na teplé otevřené pastviny, kde se vyvíjí v trusu velkých savců, převážně koní a skotu. Tesař (</w:t>
-      </w:r>
-      <w:r>
-        <w:rPr>
-          <w:rFonts w:ascii="Times New Roman" w:hAnsi="Times New Roman" w:cs="Times New Roman"/>
-          <w:smallCaps/>
-        </w:rPr>
-        <w:t>Tesař</w:t>
-      </w:r>
-      <w:r>
-        <w:rPr>
-          <w:rFonts w:ascii="Times New Roman" w:hAnsi="Times New Roman" w:cs="Times New Roman"/>
-        </w:rPr>
-        <w:t xml:space="preserve"> 1957) druh v Čechách uvádí z okolí Prahy a Radotína, na Moravě z Čejče a dalších lokalit. V posledním Červeném seznamu hodnocen jako zranitelný (</w:t>
-      </w:r>
-      <w:r>
-        <w:rPr>
-          <w:rFonts w:ascii="Times New Roman" w:hAnsi="Times New Roman" w:cs="Times New Roman"/>
-          <w:smallCaps/>
-        </w:rPr>
-        <w:t>Hejda</w:t>
-      </w:r>
-      <w:r>
-        <w:rPr>
-          <w:rFonts w:ascii="Times New Roman" w:hAnsi="Times New Roman" w:cs="Times New Roman"/>
-        </w:rPr>
-        <w:t xml:space="preserve"> et al. 2017). Na přelomu tisíciletí byl známý výskyt pouze na jižní Moravě (</w:t>
-      </w:r>
-      <w:r>
-        <w:rPr>
-          <w:rFonts w:ascii="Times New Roman" w:hAnsi="Times New Roman" w:cs="Times New Roman"/>
-          <w:smallCaps/>
-        </w:rPr>
-        <w:t>Chybík</w:t>
-      </w:r>
-      <w:r>
-        <w:rPr>
-          <w:rFonts w:ascii="Times New Roman" w:hAnsi="Times New Roman" w:cs="Times New Roman"/>
-        </w:rPr>
-        <w:t xml:space="preserve"> 2005). V Čechách by</w:t>
-      </w:r>
-      <w:r>
-        <w:rPr>
-          <w:rFonts w:ascii="Times New Roman" w:hAnsi="Times New Roman" w:cs="Times New Roman"/>
-        </w:rPr>
-        <w:t>l druh považován za vymizelý (</w:t>
-      </w:r>
-      <w:r>
-        <w:rPr>
-          <w:rFonts w:ascii="Times New Roman" w:hAnsi="Times New Roman" w:cs="Times New Roman"/>
-        </w:rPr>
-        <w:t xml:space="preserve">Juřena et al. 2008). V posledních dvou desetiletích však druh zjevně expanduje (Obr. 3). </w:t>
-      </w:r>
-      <w:r>
-        <w:rPr>
-          <w:rFonts w:ascii="Times New Roman" w:hAnsi="Times New Roman" w:cs="Times New Roman"/>
-          <w:smallCaps/>
-        </w:rPr>
-        <w:t>Peřinková</w:t>
-      </w:r>
-      <w:r>
-        <w:rPr>
-          <w:rFonts w:ascii="Times New Roman" w:hAnsi="Times New Roman" w:cs="Times New Roman"/>
-        </w:rPr>
-        <w:t xml:space="preserve"> a </w:t>
-      </w:r>
-      <w:r>
-        <w:rPr>
-          <w:rFonts w:ascii="Times New Roman" w:hAnsi="Times New Roman" w:cs="Times New Roman"/>
-          <w:smallCaps/>
-        </w:rPr>
-        <w:t>Fischer</w:t>
-      </w:r>
-      <w:r>
-        <w:rPr>
-          <w:rFonts w:ascii="Times New Roman" w:hAnsi="Times New Roman" w:cs="Times New Roman"/>
-        </w:rPr>
-        <w:t xml:space="preserve"> (2010) popisují šíření druhu do středních poloh </w:t>
-      </w:r>
-      <w:r>
-        <w:rPr>
-          <w:rFonts w:ascii="Times New Roman" w:hAnsi="Times New Roman" w:cs="Times New Roman"/>
-        </w:rPr>
-        <w:t xml:space="preserve">na jihozápadní Moravě, </w:t>
-      </w:r>
-      <w:r>
-        <w:rPr>
-          <w:rFonts w:ascii="Times New Roman" w:hAnsi="Times New Roman" w:cs="Times New Roman"/>
-          <w:smallCaps/>
-        </w:rPr>
-        <w:t>Mertlik</w:t>
-      </w:r>
-      <w:r>
-        <w:rPr>
-          <w:rFonts w:ascii="Times New Roman" w:hAnsi="Times New Roman" w:cs="Times New Roman"/>
-        </w:rPr>
-        <w:t xml:space="preserve"> (2019, 2020) dokládá šíření</w:t>
-      </w:r>
-      <w:r>
-        <w:rPr>
-          <w:rFonts w:ascii="Times New Roman" w:hAnsi="Times New Roman" w:cs="Times New Roman"/>
-        </w:rPr>
-        <w:t xml:space="preserve"> v n</w:t>
-      </w:r>
-      <w:r>
-        <w:rPr>
-          <w:rFonts w:ascii="Times New Roman" w:hAnsi="Times New Roman" w:cs="Times New Roman"/>
-        </w:rPr>
-        <w:t>ižších polohách východních Čech.</w:t>
-      </w:r>
-      <w:r>
-        <w:rPr>
-          <w:rFonts w:ascii="Times New Roman" w:hAnsi="Times New Roman" w:cs="Times New Roman"/>
-        </w:rPr>
-        <w:t xml:space="preserve"> </w:t>
-      </w:r>
-      <w:r>
-        <w:rPr>
-          <w:rFonts w:ascii="Times New Roman" w:hAnsi="Times New Roman" w:cs="Times New Roman"/>
-          <w:i/>
-          <w:iCs/>
-        </w:rPr>
-        <w:t xml:space="preserve">E. </w:t>
-      </w:r>
-      <w:proofErr w:type="gramStart"/>
-      <w:r>
-        <w:rPr>
-          <w:rFonts w:ascii="Times New Roman" w:hAnsi="Times New Roman" w:cs="Times New Roman"/>
-          <w:i/>
-          <w:iCs/>
-        </w:rPr>
-        <w:t>fulvus</w:t>
-      </w:r>
-      <w:proofErr w:type="gramEnd"/>
-      <w:r>
-        <w:rPr>
-          <w:rFonts w:ascii="Times New Roman" w:hAnsi="Times New Roman" w:cs="Times New Roman"/>
-        </w:rPr>
-        <w:t xml:space="preserve"> </w:t>
-      </w:r>
-      <w:r>
-        <w:rPr>
-          <w:rFonts w:ascii="Times New Roman" w:hAnsi="Times New Roman" w:cs="Times New Roman"/>
-        </w:rPr>
-        <w:t>byl opět potvrzen na území Prahy (</w:t>
-      </w:r>
-      <w:r>
-        <w:rPr>
-          <w:rFonts w:ascii="Times New Roman" w:hAnsi="Times New Roman" w:cs="Times New Roman"/>
-          <w:smallCaps/>
-        </w:rPr>
-        <w:t>Sommer</w:t>
-      </w:r>
-      <w:r>
-        <w:rPr>
-          <w:rFonts w:ascii="Times New Roman" w:hAnsi="Times New Roman" w:cs="Times New Roman"/>
-        </w:rPr>
-        <w:t xml:space="preserve"> et al. 2024) a Českého krasu (</w:t>
-      </w:r>
-      <w:r>
-        <w:rPr>
-          <w:rFonts w:ascii="Times New Roman" w:hAnsi="Times New Roman" w:cs="Times New Roman"/>
-          <w:smallCaps/>
-        </w:rPr>
-        <w:t>Koštíř</w:t>
-      </w:r>
-      <w:r>
-        <w:rPr>
-          <w:rFonts w:ascii="Times New Roman" w:hAnsi="Times New Roman" w:cs="Times New Roman"/>
-        </w:rPr>
-        <w:t xml:space="preserve"> 2024). Nalezen byl i na Šumavě v nadmořské výšce 800 m. n. m. (</w:t>
-      </w:r>
-      <w:r>
-        <w:rPr>
-          <w:rFonts w:ascii="Times New Roman" w:hAnsi="Times New Roman" w:cs="Times New Roman"/>
-          <w:smallCaps/>
-        </w:rPr>
-        <w:t>Ambrožová</w:t>
-      </w:r>
-      <w:r>
-        <w:rPr>
-          <w:rFonts w:ascii="Times New Roman" w:hAnsi="Times New Roman" w:cs="Times New Roman"/>
-        </w:rPr>
-        <w:t xml:space="preserve"> et al. 2021). Historické údaje z území západních Čech byly publikovány z Františkových Lázní, Stříbra a Horažďovic (</w:t>
-      </w:r>
-      <w:r>
-        <w:rPr>
-          <w:rFonts w:ascii="Times New Roman" w:hAnsi="Times New Roman" w:cs="Times New Roman"/>
-          <w:smallCaps/>
-        </w:rPr>
-        <w:t>Juřena</w:t>
-      </w:r>
-      <w:r>
-        <w:rPr>
-          <w:rFonts w:ascii="Times New Roman" w:hAnsi="Times New Roman" w:cs="Times New Roman"/>
-        </w:rPr>
-        <w:t xml:space="preserve"> et al. 2008). Z území Plzeňského a Karlovarského kraje nebyl výskyt druhu v posledních desetiletích publikován (</w:t>
-      </w:r>
-      <w:r>
-        <w:rPr>
-          <w:rFonts w:ascii="Times New Roman" w:hAnsi="Times New Roman" w:cs="Times New Roman"/>
-          <w:smallCaps/>
-        </w:rPr>
-        <w:t>Týr</w:t>
-      </w:r>
-      <w:r>
-        <w:rPr>
-          <w:rFonts w:ascii="Times New Roman" w:hAnsi="Times New Roman" w:cs="Times New Roman"/>
-        </w:rPr>
-        <w:t xml:space="preserve"> 2021). Podobný trend šíření byl zaznamenán i v </w:t>
-      </w:r>
-      <w:r>
-        <w:rPr>
-          <w:rFonts w:ascii="Times New Roman" w:hAnsi="Times New Roman" w:cs="Times New Roman"/>
-        </w:rPr>
-        <w:lastRenderedPageBreak/>
-        <w:t>sousedním Německu (</w:t>
-      </w:r>
-      <w:r>
-        <w:rPr>
-          <w:rFonts w:ascii="Times New Roman" w:hAnsi="Times New Roman" w:cs="Times New Roman"/>
-          <w:smallCaps/>
-        </w:rPr>
-        <w:t>iNaturalist</w:t>
-      </w:r>
-      <w:r>
-        <w:rPr>
-          <w:rFonts w:ascii="Times New Roman" w:hAnsi="Times New Roman" w:cs="Times New Roman"/>
-        </w:rPr>
-        <w:t xml:space="preserve"> </w:t>
-      </w:r>
-      <w:r>
-        <w:rPr>
-          <w:rFonts w:ascii="Times New Roman" w:hAnsi="Times New Roman" w:cs="Times New Roman"/>
-          <w:smallCaps/>
-        </w:rPr>
-        <w:t>contributors</w:t>
-      </w:r>
-      <w:r>
-        <w:rPr>
-          <w:rFonts w:ascii="Times New Roman" w:hAnsi="Times New Roman" w:cs="Times New Roman"/>
-        </w:rPr>
-        <w:t xml:space="preserve"> 2025). Výše uvedený nález představuje první publikovaný doklad výskytu druhu na území Plzeňského a Karlovarského kraje po 56 letech.</w:t>
-      </w:r>
-    </w:p>
-    <w:p>
-      <w:pPr>
         <w:pStyle w:val="FirstParagraph"/>
         <w:rPr>
           <w:rFonts w:ascii="Times New Roman" w:hAnsi="Times New Roman" w:cs="Times New Roman"/>
         </w:rPr>
       </w:pPr>
-      <w:bookmarkStart w:id="2" w:name="poděkování"/>
+      <w:bookmarkStart w:id="3" w:name="poděkování"/>
       <w:bookmarkEnd w:id="1"/>
       <w:r>
         <w:rPr>
@@ -779,8 +797,8 @@
           <w:szCs w:val="24"/>
         </w:rPr>
       </w:pPr>
-      <w:bookmarkStart w:id="3" w:name="přílohy"/>
-      <w:bookmarkEnd w:id="2"/>
+      <w:bookmarkStart w:id="4" w:name="přílohy"/>
+      <w:bookmarkEnd w:id="3"/>
       <w:r>
         <w:rPr>
           <w:rFonts w:ascii="Times New Roman" w:hAnsi="Times New Roman" w:cs="Times New Roman"/>
@@ -932,8 +950,8 @@
           <w:szCs w:val="24"/>
         </w:rPr>
       </w:pPr>
-      <w:bookmarkStart w:id="4" w:name="literatura"/>
-      <w:bookmarkEnd w:id="3"/>
+      <w:bookmarkStart w:id="5" w:name="literatura"/>
+      <w:bookmarkEnd w:id="4"/>
       <w:r>
         <w:rPr>
           <w:rFonts w:ascii="Times New Roman" w:hAnsi="Times New Roman" w:cs="Times New Roman"/>
@@ -962,8 +980,8 @@
           <w:rFonts w:ascii="Times New Roman" w:hAnsi="Times New Roman" w:cs="Times New Roman"/>
         </w:rPr>
       </w:pPr>
-      <w:bookmarkStart w:id="5" w:name="ref-ambrozova2021"/>
-      <w:bookmarkStart w:id="6" w:name="refs"/>
+      <w:bookmarkStart w:id="6" w:name="ref-ambrozova2021"/>
+      <w:bookmarkStart w:id="7" w:name="refs"/>
       <w:r>
         <w:rPr>
           <w:rFonts w:ascii="Times New Roman" w:hAnsi="Times New Roman" w:cs="Times New Roman"/>
@@ -999,8 +1017,8 @@
           <w:rFonts w:ascii="Times New Roman" w:hAnsi="Times New Roman" w:cs="Times New Roman"/>
         </w:rPr>
       </w:pPr>
-      <w:bookmarkStart w:id="7" w:name="ref-aopk2025"/>
-      <w:bookmarkEnd w:id="5"/>
+      <w:bookmarkStart w:id="8" w:name="ref-aopk2025"/>
+      <w:bookmarkEnd w:id="6"/>
       <w:r>
         <w:rPr>
           <w:rFonts w:ascii="Times New Roman" w:hAnsi="Times New Roman" w:cs="Times New Roman"/>
@@ -1063,8 +1081,8 @@
           <w:rFonts w:ascii="Times New Roman" w:hAnsi="Times New Roman" w:cs="Times New Roman"/>
         </w:rPr>
       </w:pPr>
-      <w:bookmarkStart w:id="8" w:name="ref-hejda2017"/>
-      <w:bookmarkEnd w:id="7"/>
+      <w:bookmarkStart w:id="9" w:name="ref-hejda2017"/>
+      <w:bookmarkEnd w:id="8"/>
       <w:r>
         <w:rPr>
           <w:rFonts w:ascii="Times New Roman" w:hAnsi="Times New Roman" w:cs="Times New Roman"/>
@@ -1086,8 +1104,8 @@
           <w:rFonts w:ascii="Times New Roman" w:hAnsi="Times New Roman" w:cs="Times New Roman"/>
         </w:rPr>
       </w:pPr>
-      <w:bookmarkStart w:id="9" w:name="ref-chybik2005"/>
-      <w:bookmarkEnd w:id="8"/>
+      <w:bookmarkStart w:id="10" w:name="ref-chybik2005"/>
+      <w:bookmarkEnd w:id="9"/>
       <w:r>
         <w:rPr>
           <w:rFonts w:ascii="Times New Roman" w:hAnsi="Times New Roman" w:cs="Times New Roman"/>
@@ -1109,8 +1127,8 @@
           <w:rFonts w:ascii="Times New Roman" w:hAnsi="Times New Roman" w:cs="Times New Roman"/>
         </w:rPr>
       </w:pPr>
-      <w:bookmarkStart w:id="10" w:name="ref-iNaturalist2025"/>
-      <w:bookmarkEnd w:id="9"/>
+      <w:bookmarkStart w:id="11" w:name="ref-iNaturalist2025"/>
+      <w:bookmarkEnd w:id="10"/>
       <w:r>
         <w:rPr>
           <w:rFonts w:ascii="Times New Roman" w:hAnsi="Times New Roman" w:cs="Times New Roman"/>
@@ -1142,8 +1160,8 @@
           <w:rFonts w:ascii="Times New Roman" w:hAnsi="Times New Roman" w:cs="Times New Roman"/>
         </w:rPr>
       </w:pPr>
-      <w:bookmarkStart w:id="11" w:name="ref-jurena2008"/>
-      <w:bookmarkEnd w:id="10"/>
+      <w:bookmarkStart w:id="12" w:name="ref-jurena2008"/>
+      <w:bookmarkEnd w:id="11"/>
       <w:r>
         <w:rPr>
           <w:rFonts w:ascii="Times New Roman" w:hAnsi="Times New Roman" w:cs="Times New Roman"/>
@@ -1165,8 +1183,8 @@
           <w:rFonts w:ascii="Times New Roman" w:hAnsi="Times New Roman" w:cs="Times New Roman"/>
         </w:rPr>
       </w:pPr>
-      <w:bookmarkStart w:id="12" w:name="ref-kostir2024"/>
-      <w:bookmarkEnd w:id="11"/>
+      <w:bookmarkStart w:id="13" w:name="ref-kostir2024"/>
+      <w:bookmarkEnd w:id="12"/>
       <w:r>
         <w:rPr>
           <w:rFonts w:ascii="Times New Roman" w:hAnsi="Times New Roman" w:cs="Times New Roman"/>
@@ -1188,8 +1206,8 @@
           <w:rFonts w:ascii="Times New Roman" w:hAnsi="Times New Roman" w:cs="Times New Roman"/>
         </w:rPr>
       </w:pPr>
-      <w:bookmarkStart w:id="13" w:name="ref-mertlik2019"/>
-      <w:bookmarkEnd w:id="12"/>
+      <w:bookmarkStart w:id="14" w:name="ref-mertlik2019"/>
+      <w:bookmarkEnd w:id="13"/>
       <w:r>
         <w:rPr>
           <w:rFonts w:ascii="Times New Roman" w:hAnsi="Times New Roman" w:cs="Times New Roman"/>
@@ -1201,15 +1219,7 @@
         <w:rPr>
           <w:rFonts w:ascii="Times New Roman" w:hAnsi="Times New Roman" w:cs="Times New Roman"/>
         </w:rPr>
-        <w:t xml:space="preserve"> 2019: Expanzivní druhy čeledí Geotrupidae a Scarabaeidae (Coleoptera) na území východních Čech.[</w:t>
-      </w:r>
-      <w:bookmarkStart w:id="14" w:name="_GoBack"/>
-      <w:bookmarkEnd w:id="14"/>
-      <w:r>
-        <w:rPr>
-          <w:rFonts w:ascii="Times New Roman" w:hAnsi="Times New Roman" w:cs="Times New Roman"/>
-        </w:rPr>
-        <w:t>Expansive species of Geotrupidae and Scarabaeidae (Coleoptera) from eastern Bohemia]. Elateridarium 13: 35–48.</w:t>
+        <w:t xml:space="preserve"> 2019: Expanzivní druhy čeledí Geotrupidae a Scarabaeidae (Coleoptera) na území východních Čech.[Expansive species of Geotrupidae and Scarabaeidae (Coleoptera) from eastern Bohemia]. Elateridarium 13: 35–48.</w:t>
       </w:r>
     </w:p>
     <w:p>
@@ -1220,7 +1230,7 @@
         </w:rPr>
       </w:pPr>
       <w:bookmarkStart w:id="15" w:name="ref-mertlik2020"/>
-      <w:bookmarkEnd w:id="13"/>
+      <w:bookmarkEnd w:id="14"/>
       <w:r>
         <w:rPr>
           <w:rFonts w:ascii="Times New Roman" w:hAnsi="Times New Roman" w:cs="Times New Roman"/>
@@ -1242,6 +1252,60 @@
           <w:rFonts w:ascii="Times New Roman" w:hAnsi="Times New Roman" w:cs="Times New Roman"/>
         </w:rPr>
       </w:pPr>
+      <w:r>
+        <w:rPr>
+          <w:rFonts w:ascii="Times New Roman" w:hAnsi="Times New Roman" w:cs="Times New Roman"/>
+          <w:smallCaps/>
+        </w:rPr>
+        <w:t>Miessen</w:t>
+      </w:r>
+      <w:r>
+        <w:rPr>
+          <w:rFonts w:ascii="Times New Roman" w:hAnsi="Times New Roman" w:cs="Times New Roman"/>
+          <w:smallCaps/>
+        </w:rPr>
+        <w:t xml:space="preserve"> G. &amp; </w:t>
+      </w:r>
+      <w:r>
+        <w:rPr>
+          <w:rFonts w:ascii="Times New Roman" w:hAnsi="Times New Roman" w:cs="Times New Roman"/>
+          <w:smallCaps/>
+        </w:rPr>
+        <w:t>Thieren</w:t>
+      </w:r>
+      <w:r>
+        <w:rPr>
+          <w:rFonts w:ascii="Times New Roman" w:hAnsi="Times New Roman" w:cs="Times New Roman"/>
+          <w:smallCaps/>
+        </w:rPr>
+        <w:t xml:space="preserve"> Y.</w:t>
+      </w:r>
+      <w:r>
+        <w:rPr>
+          <w:rFonts w:ascii="Times New Roman" w:hAnsi="Times New Roman" w:cs="Times New Roman"/>
+        </w:rPr>
+        <w:t xml:space="preserve"> 1998: Une capture récente d´Euoniticellus fulvus (Goeze, 1777) en Belgique.</w:t>
+      </w:r>
+      <w:r>
+        <w:rPr>
+          <w:rFonts w:ascii="Times New Roman" w:hAnsi="Times New Roman" w:cs="Times New Roman"/>
+        </w:rPr>
+        <w:t xml:space="preserve"> </w:t>
+      </w:r>
+      <w:r>
+        <w:rPr>
+          <w:rFonts w:ascii="Times New Roman" w:hAnsi="Times New Roman" w:cs="Times New Roman"/>
+        </w:rPr>
+        <w:t>Lambillionea 98: 83–84.</w:t>
+      </w:r>
+    </w:p>
+    <w:p>
+      <w:pPr>
+        <w:pStyle w:val="Bibliografie"/>
+        <w:rPr>
+          <w:rFonts w:ascii="Times New Roman" w:hAnsi="Times New Roman" w:cs="Times New Roman"/>
+        </w:rPr>
+      </w:pPr>
       <w:bookmarkStart w:id="16" w:name="ref-perinkova2010"/>
       <w:bookmarkEnd w:id="15"/>
       <w:r>
@@ -1249,36 +1313,13 @@
           <w:rFonts w:ascii="Times New Roman" w:hAnsi="Times New Roman" w:cs="Times New Roman"/>
           <w:smallCaps/>
         </w:rPr>
-        <w:t xml:space="preserve">Peřinková P. &amp; Fischer </w:t>
-      </w:r>
-      <w:proofErr w:type="gramStart"/>
-      <w:r>
-        <w:rPr>
-          <w:rFonts w:ascii="Times New Roman" w:hAnsi="Times New Roman" w:cs="Times New Roman"/>
-          <w:smallCaps/>
-        </w:rPr>
-        <w:t>O.A.</w:t>
-      </w:r>
-      <w:proofErr w:type="gramEnd"/>
-      <w:r>
-        <w:rPr>
-          <w:rFonts w:ascii="Times New Roman" w:hAnsi="Times New Roman" w:cs="Times New Roman"/>
-        </w:rPr>
-        <w:t xml:space="preserve"> 2010: Euoniticellus fulvus (Goeze, </w:t>
-      </w:r>
-      <w:proofErr w:type="gramStart"/>
-      <w:r>
-        <w:rPr>
-          <w:rFonts w:ascii="Times New Roman" w:hAnsi="Times New Roman" w:cs="Times New Roman"/>
-        </w:rPr>
-        <w:t>1777)(Coleoptera</w:t>
-      </w:r>
-      <w:proofErr w:type="gramEnd"/>
-      <w:r>
-        <w:rPr>
-          <w:rFonts w:ascii="Times New Roman" w:hAnsi="Times New Roman" w:cs="Times New Roman"/>
-        </w:rPr>
-        <w:t>: Scarabaeidae) in south-western Moravia (Czech Republic). Acta Musei Moraviae, Scientiae biologicae (Brno) 95: 25–28.</w:t>
+        <w:t>Peřinková P. &amp; Fischer O.A.</w:t>
+      </w:r>
+      <w:r>
+        <w:rPr>
+          <w:rFonts w:ascii="Times New Roman" w:hAnsi="Times New Roman" w:cs="Times New Roman"/>
+        </w:rPr>
+        <w:t xml:space="preserve"> 2010: Euoniticellus fulvus (Goeze, 1777)(Coleoptera: Scarabaeidae) in south-western Moravia (Czech Republic). Acta Musei Moraviae, Scientiae biologicae (Brno) 95: 25–28.</w:t>
       </w:r>
     </w:p>
     <w:p>
@@ -1357,35 +1398,7 @@
         <w:rPr>
           <w:rFonts w:ascii="Times New Roman" w:hAnsi="Times New Roman" w:cs="Times New Roman"/>
         </w:rPr>
-        <w:t xml:space="preserve"> 1957: Brouci listorozí, Lamellicornia. Díl II. </w:t>
-      </w:r>
-      <w:proofErr w:type="gramStart"/>
-      <w:r>
-        <w:rPr>
-          <w:rFonts w:ascii="Times New Roman" w:hAnsi="Times New Roman" w:cs="Times New Roman"/>
-        </w:rPr>
-        <w:t>Scarabaeidae</w:t>
-      </w:r>
-      <w:proofErr w:type="gramEnd"/>
-      <w:r>
-        <w:rPr>
-          <w:rFonts w:ascii="Times New Roman" w:hAnsi="Times New Roman" w:cs="Times New Roman"/>
-        </w:rPr>
-        <w:t>–</w:t>
-      </w:r>
-      <w:proofErr w:type="gramStart"/>
-      <w:r>
-        <w:rPr>
-          <w:rFonts w:ascii="Times New Roman" w:hAnsi="Times New Roman" w:cs="Times New Roman"/>
-        </w:rPr>
-        <w:t>vrubounovití</w:t>
-      </w:r>
-      <w:proofErr w:type="gramEnd"/>
-      <w:r>
-        <w:rPr>
-          <w:rFonts w:ascii="Times New Roman" w:hAnsi="Times New Roman" w:cs="Times New Roman"/>
-        </w:rPr>
-        <w:t>, Laparosticti. Fauna ČSR 11. NČSAV, Praha 326</w:t>
+        <w:t xml:space="preserve"> 1957: Brouci listorozí, Lamellicornia. Díl II. Scarabaeidae–vrubounovití, Laparosticti. Fauna ČSR 11. NČSAV, Praha 326</w:t>
       </w:r>
     </w:p>
     <w:p>
@@ -1410,8 +1423,8 @@
         </w:rPr>
         <w:t xml:space="preserve"> 2021: Soupis nálezů vrubounovitých brouků (Coleoptera: Scarabaeoidea) ze západních Čech. Inventory of lamellicorn beetles (Coleoptera: Scarabaeoidea) from western Bohemia). Západočeské entomologické listy Supplementum 2: 1–85.</w:t>
       </w:r>
-      <w:bookmarkEnd w:id="4"/>
-      <w:bookmarkEnd w:id="6"/>
+      <w:bookmarkEnd w:id="5"/>
+      <w:bookmarkEnd w:id="7"/>
       <w:bookmarkEnd w:id="20"/>
     </w:p>
     <w:sectPr>

</xml_diff>